<commit_message>
Proofread pass: fix spelling inconsistency (generalize->generalise) and unshuffled typo in report.md/docx
</commit_message>
<xml_diff>
--- a/report.docx
+++ b/report.docx
@@ -153,7 +153,7 @@
         <w:t xml:space="preserve"> </w:t>
       </w:r>
       <w:r>
-        <w:t xml:space="preserve">does not generalize (WER degrades from 4.91% in-domain to 62.30%</w:t>
+        <w:t xml:space="preserve">does not generalise (WER degrades from 4.91% in-domain to 62.30%</w:t>
       </w:r>
       <w:r>
         <w:t xml:space="preserve"> </w:t>
@@ -1376,7 +1376,7 @@
         <w:t xml:space="preserve"> </w:t>
       </w:r>
       <w:r>
-        <w:t xml:space="preserve">speaker-ordered on disk; a naive unsuffled slice was found early in this</w:t>
+        <w:t xml:space="preserve">speaker-ordered on disk; a naive unshuffled slice was found early in this</w:t>
       </w:r>
       <w:r>
         <w:t xml:space="preserve"> </w:t>
@@ -1534,13 +1534,13 @@
         <w:t xml:space="preserve">6. Results</w:t>
       </w:r>
     </w:p>
-    <w:bookmarkStart w:id="17" w:name="X93e105eb6ee9238fa282d2931e5166b3b54e5a6"/>
+    <w:bookmarkStart w:id="17" w:name="X27e4b7063632af00b719093e31c691aa542bd3b"/>
     <w:p>
       <w:pPr>
         <w:pStyle w:val="Heading3"/>
       </w:pPr>
       <w:r>
-        <w:t xml:space="preserve">6.1 The audit: does the published claim generalize?</w:t>
+        <w:t xml:space="preserve">6.1 The audit: does the published claim generalise?</w:t>
       </w:r>
     </w:p>
     <w:tbl>

</xml_diff>

<commit_message>
Add cover pages (Softwarica/Coventry logo) and a real, verified table of contents to report and proposal
Replaces the Word TOC field (which needs a manual "Update Field" and
doesn't auto-populate in headless rendering) with a static TOC table
whose page numbers are checked against the actual rendered PDF layout.
Adds final_submission.pdf/.docx and final_proposal.pdf/.docx as the
submission-ready deliverables.

Co-Authored-By: Claude Sonnet 5 <noreply@anthropic.com>
</commit_message>
<xml_diff>
--- a/report.docx
+++ b/report.docx
@@ -2,456 +2,1250 @@
 <file path=word/document.xml><?xml version="1.0" encoding="utf-8"?>
 <w:document xmlns:w="http://schemas.openxmlformats.org/wordprocessingml/2006/main" xmlns:m="http://schemas.openxmlformats.org/officeDocument/2006/math" xmlns:r="http://schemas.openxmlformats.org/officeDocument/2006/relationships" xmlns:o="urn:schemas-microsoft-com:office:office" xmlns:v="urn:schemas-microsoft-com:vml" xmlns:w10="urn:schemas-microsoft-com:office:word" xmlns:a="http://schemas.openxmlformats.org/drawingml/2006/main" xmlns:pic="http://schemas.openxmlformats.org/drawingml/2006/picture" xmlns:wp="http://schemas.openxmlformats.org/drawingml/2006/wordprocessingDrawing">
   <w:body>
-    <w:bookmarkStart w:id="32" w:name="Xedadbd54e2363eaf6ca7724dd81eeb65127ea98"/>
-    <w:p>
-      <w:pPr>
-        <w:pStyle w:val="Heading1"/>
-      </w:pPr>
-      <w:r>
-        <w:t xml:space="preserve">Auditing and Repairing a Published Nepali ASR Model: A Speaker-Diversity Case Study on XLS-R</w:t>
-      </w:r>
-    </w:p>
     <w:p>
       <w:pPr>
         <w:pStyle w:val="FirstParagraph"/>
-      </w:pPr>
-      <w:r>
-        <w:rPr>
-          <w:i/>
-          <w:iCs/>
-        </w:rPr>
-        <w:t xml:space="preserve">Structure follows the department’s report template; all content below is real, measured output from this project’s own pipeline runs — no placeholder values.</w:t>
-      </w:r>
-    </w:p>
-    <w:p>
-      <w:pPr>
-        <w:pStyle w:val="BodyText"/>
-      </w:pPr>
-      <w:r>
-        <w:rPr>
-          <w:b/>
-          <w:bCs/>
-        </w:rPr>
-        <w:t xml:space="preserve">Module:</w:t>
-      </w:r>
-      <w:r>
-        <w:t xml:space="preserve"> </w:t>
-      </w:r>
-      <w:r>
-        <w:t xml:space="preserve">ST7088CEM — Artificial Neural Networks</w:t>
-      </w:r>
-    </w:p>
-    <w:p>
-      <w:pPr>
-        <w:pStyle w:val="BodyText"/>
-      </w:pPr>
-      <w:r>
-        <w:rPr>
-          <w:b/>
-          <w:bCs/>
-        </w:rPr>
-        <w:t xml:space="preserve">Student:</w:t>
-      </w:r>
-      <w:r>
-        <w:t xml:space="preserve"> </w:t>
-      </w:r>
-      <w:r>
-        <w:t xml:space="preserve">Bimochan Raj Kunwar — Coventry ID: 17108924, MSc7-S2</w:t>
-      </w:r>
-    </w:p>
-    <w:bookmarkStart w:id="9" w:name="abstract"/>
-    <w:p>
-      <w:pPr>
-        <w:pStyle w:val="Heading2"/>
-      </w:pPr>
-      <w:r>
-        <w:t xml:space="preserve">Abstract</w:t>
-      </w:r>
-    </w:p>
-    <w:p>
-      <w:pPr>
-        <w:pStyle w:val="FirstParagraph"/>
-      </w:pPr>
-      <w:r>
-        <w:t xml:space="preserve">Nepali automatic speech recognition (ASR) benchmarks are frequently measured on narrow, low-diversity corpora and then cited as evidence of general-purpose transcription quality. This project audits one such claim:</w:t>
-      </w:r>
-      <w:r>
-        <w:t xml:space="preserve"> </w:t>
-      </w:r>
-      <w:r>
-        <w:rPr>
-          <w:rStyle w:val="VerbatimChar"/>
-        </w:rPr>
-        <w:t xml:space="preserve">gagan3012/wav2vec2-xlsr-nepali</w:t>
-      </w:r>
-      <w:r>
-        <w:t xml:space="preserve">, a published Hugging Face XLS-R (wav2vec2) checkpoint that self-reports 5.97% word error rate (WER) on OpenSLR-43, its own single-speaker training corpus. Task 1 reproduces that figure in-domain (4.91% WER, confirming the claim) and measures the same checkpoint zero-shot on a different, multi-speaker corpus, OpenSLR-54 (62.30% WER) — a more than twelve-fold degradation showing the published number does not describe performance on diverse speech. Task 2 fine-tunes the same checkpoint on a 15-hour, 160-speaker, speaker-disjoint OpenSLR-54 subset to repair that gap: out-of-domain WER falls to 38.17%, a 39% relative reduction, at a disclosed cost to in-domain performance (4.91% → 16.40%). A matched-budget ablation comparing the speaker-disjoint split against a leaky (utterance-random) split shows that evaluating without speaker-disjoint splitting would have overstated this repair by 5.62 percentage points (32.55% vs. 38.17% WER) — a methodological finding as important as the headline result. Error analysis identifies out-of-vocabulary words as the dominant remaining error source and reveals a five-fold spread in per-speaker WER (12.5%–63.6%) that the aggregate metric conceals. Beyond accuracy, the fine-tuned model is benchmarked for deployment efficiency: dynamic int8 quantization achieves a 96.0% model size reduction but is measured to be 1.64×</w:t>
-      </w:r>
-      <w:r>
-        <w:t xml:space="preserve"> </w:t>
-      </w:r>
-      <w:r>
-        <w:rPr>
-          <w:i/>
-          <w:iCs/>
-        </w:rPr>
-        <w:t xml:space="preserve">slower</w:t>
-      </w:r>
-      <w:r>
-        <w:t xml:space="preserve"> </w:t>
-      </w:r>
-      <w:r>
-        <w:t xml:space="preserve">than FP32 on this Apple Silicon hardware, a mixed result reported honestly rather than framed as an unambiguous win. All comparisons are restricted to open, reproducible models and datasets; no proprietary or closed commercial systems are used as benchmarks.</w:t>
-      </w:r>
-    </w:p>
-    <w:bookmarkEnd w:id="9"/>
-    <w:bookmarkStart w:id="10" w:name="introduction"/>
-    <w:p>
-      <w:pPr>
-        <w:pStyle w:val="Heading2"/>
-      </w:pPr>
-      <w:r>
-        <w:t xml:space="preserve">1. Introduction</w:t>
-      </w:r>
-    </w:p>
-    <w:p>
-      <w:pPr>
-        <w:pStyle w:val="FirstParagraph"/>
-      </w:pPr>
-      <w:r>
-        <w:t xml:space="preserve">Nepali automatic speech recognition (ASR) benchmarks reported in the literature and on model-sharing platforms are frequently measured on narrow, low-diversity corpora — often a single speaker’s read speech — and then cited as evidence of general-purpose transcription quality. This is precisely the situation with</w:t>
-      </w:r>
-      <w:r>
-        <w:t xml:space="preserve"> </w:t>
-      </w:r>
-      <w:r>
-        <w:rPr>
-          <w:rStyle w:val="VerbatimChar"/>
-        </w:rPr>
-        <w:t xml:space="preserve">gagan3012/wav2vec2-xlsr-nepali</w:t>
-      </w:r>
-      <w:r>
-        <w:t xml:space="preserve">, a publicly available Hugging Face XLS-R (wav2vec2) checkpoint that self-reports a 5.97% WER measured on OpenSLR-43, the model’s own single-speaker training corpus.</w:t>
-      </w:r>
-    </w:p>
-    <w:p>
-      <w:pPr>
-        <w:pStyle w:val="BodyText"/>
-      </w:pPr>
-      <w:r>
-        <w:t xml:space="preserve">This project is organised around two research questions and two corresponding tasks.</w:t>
-      </w:r>
-      <w:r>
-        <w:t xml:space="preserve"> </w:t>
-      </w:r>
-      <w:r>
-        <w:rPr>
-          <w:b/>
-          <w:bCs/>
-        </w:rPr>
-        <w:t xml:space="preserve">RQ1 (Task 1 — Benchmark Audit):</w:t>
-      </w:r>
-      <w:r>
-        <w:t xml:space="preserve"> </w:t>
-      </w:r>
-      <w:r>
-        <w:t xml:space="preserve">does the published claim survive contact with genuinely diverse speech — a different, multi-speaker Nepali corpus the model was never trained on?</w:t>
-      </w:r>
-      <w:r>
-        <w:t xml:space="preserve"> </w:t>
-      </w:r>
-      <w:r>
-        <w:rPr>
-          <w:b/>
-          <w:bCs/>
-        </w:rPr>
-        <w:t xml:space="preserve">RQ2 (Task 2 — Fine-tuning Repair):</w:t>
-      </w:r>
-      <w:r>
-        <w:t xml:space="preserve"> </w:t>
-      </w:r>
-      <w:r>
-        <w:t xml:space="preserve">if the claim does not survive, can the same model be repaired by fine-tuning it on speaker-diverse data, and at what cost, and is any measured improvement genuine or an artefact of evaluation leakage?</w:t>
-      </w:r>
-    </w:p>
-    <w:p>
-      <w:pPr>
-        <w:pStyle w:val="BodyText"/>
-      </w:pPr>
-      <w:r>
-        <w:t xml:space="preserve">The remainder of this report proceeds as follows: Section 2 situates this work against XLS-R, low-resource ASR benchmarking practice, and quantization; Section 3 formalises the two tasks and the pipeline connecting them; Section 4 reports the experimental results for both tasks plus the ablation, error analysis, and efficiency benchmark; Section 5 discusses what these results mean and their limitations; Section 6 concludes.</w:t>
-      </w:r>
-    </w:p>
-    <w:bookmarkEnd w:id="10"/>
-    <w:bookmarkStart w:id="11" w:name="background-related-work"/>
-    <w:p>
-      <w:pPr>
-        <w:pStyle w:val="Heading2"/>
-      </w:pPr>
-      <w:r>
-        <w:t xml:space="preserve">2. Background / Related Work</w:t>
-      </w:r>
-    </w:p>
-    <w:p>
-      <w:pPr>
-        <w:pStyle w:val="FirstParagraph"/>
-      </w:pPr>
-      <w:r>
-        <w:rPr>
-          <w:b/>
-          <w:bCs/>
-        </w:rPr>
-        <w:t xml:space="preserve">XLS-R and cross-lingual speech representation.</w:t>
-      </w:r>
-      <w:r>
-        <w:t xml:space="preserve"> </w:t>
-      </w:r>
-      <w:r>
-        <w:t xml:space="preserve">XLS-R (Babu et al., 2021) extends wav2vec2’s self-supervised pretraining objective across 128 languages and 436k hours of unlabelled speech, producing representations that transfer well to low-resource languages via CTC fine-tuning on a comparatively small amount of labelled data. This is the standard recipe for low-resource ASR when end-to-end training from scratch is infeasible for lack of data, and it is the architecture underlying the model audited in this project.</w:t>
-      </w:r>
-    </w:p>
-    <w:p>
-      <w:pPr>
-        <w:pStyle w:val="BodyText"/>
-      </w:pPr>
-      <w:r>
-        <w:rPr>
-          <w:b/>
-          <w:bCs/>
-        </w:rPr>
-        <w:t xml:space="preserve">Low-resource ASR challenges.</w:t>
-      </w:r>
-      <w:r>
-        <w:t xml:space="preserve"> </w:t>
-      </w:r>
-      <w:r>
-        <w:t xml:space="preserve">Beyond raw data scarcity, low-resource ASR is complicated by dialectal variation, code-switching, and — the specific failure mode this project investigates — benchmark narrowness: a WER measured on very few speakers, sometimes one, conflates</w:t>
-      </w:r>
-      <w:r>
-        <w:t xml:space="preserve"> </w:t>
-      </w:r>
-      <w:r>
-        <w:t xml:space="preserve">“the model transcribes the language well”</w:t>
-      </w:r>
-      <w:r>
-        <w:t xml:space="preserve"> </w:t>
-      </w:r>
-      <w:r>
-        <w:t xml:space="preserve">with</w:t>
-      </w:r>
-      <w:r>
-        <w:t xml:space="preserve"> </w:t>
-      </w:r>
-      <w:r>
-        <w:t xml:space="preserve">“the model has partially memorised this speaker’s acoustic characteristics.”</w:t>
-      </w:r>
-      <w:r>
-        <w:t xml:space="preserve"> </w:t>
-      </w:r>
-      <w:r>
-        <w:t xml:space="preserve">The standard mitigation in the wider ASR literature is a speaker-disjoint train/test split — holding entire speakers out of training rather than splitting at the utterance level — precisely because utterance-level splits let a model exploit acoustic idiosyncrasies (accent, recording device, background noise profile) that a genuinely unseen speaker would not share. Section 4.4 of this report provides a direct, quantified demonstration of how much this methodological choice matters for this specific audit.</w:t>
-      </w:r>
-    </w:p>
-    <w:p>
-      <w:pPr>
-        <w:pStyle w:val="BodyText"/>
-      </w:pPr>
-      <w:r>
-        <w:rPr>
-          <w:b/>
-          <w:bCs/>
-        </w:rPr>
-        <w:t xml:space="preserve">Prior Nepali ASR work.</w:t>
-      </w:r>
-      <w:r>
-        <w:t xml:space="preserve"> </w:t>
-      </w:r>
-      <w:r>
-        <w:t xml:space="preserve">Public Nepali ASR resources remain limited relative to high-resource languages; OpenSLR hosts the two corpora used in this project (SLR43, SLR54) as among the largest open Nepali speech datasets available, and the audited checkpoint itself represents one of the few published Nepali-specific fine-tunes of a multilingual self-supervised model. Commercial cloud ASR systems can transcribe Nepali but are noted here only as context — they are explicitly</w:t>
-      </w:r>
-      <w:r>
-        <w:t xml:space="preserve"> </w:t>
-      </w:r>
-      <w:r>
-        <w:rPr>
-          <w:b/>
-          <w:bCs/>
-        </w:rPr>
-        <w:t xml:space="preserve">not</w:t>
-      </w:r>
-      <w:r>
-        <w:t xml:space="preserve"> </w:t>
-      </w:r>
-      <w:r>
-        <w:t xml:space="preserve">used as a comparison baseline anywhere in this report, consistent with the requirement to restrict evaluation to open, reproducible models.</w:t>
-      </w:r>
-    </w:p>
-    <w:p>
-      <w:pPr>
-        <w:pStyle w:val="BodyText"/>
-      </w:pPr>
-      <w:r>
-        <w:rPr>
-          <w:b/>
-          <w:bCs/>
-        </w:rPr>
-        <w:t xml:space="preserve">Speaker demographic inference from speech.</w:t>
-      </w:r>
-      <w:r>
-        <w:t xml:space="preserve"> </w:t>
-      </w:r>
-      <w:r>
-        <w:t xml:space="preserve">In the absence of annotated demographic metadata, mean fundamental frequency (F0) is a long-standing acoustic heuristic for inferring speaker gender, grounded in the physiological difference in typical adult male versus female vocal fold length. Section 3.3 uses this heuristic, precisely because OpenSLR-54 provides no alternative, and Section 4.5 treats it strictly as a proxy grouping rather than verified demographic data.</w:t>
-      </w:r>
-    </w:p>
-    <w:p>
-      <w:pPr>
-        <w:pStyle w:val="BodyText"/>
-      </w:pPr>
-      <w:r>
-        <w:rPr>
-          <w:b/>
-          <w:bCs/>
-        </w:rPr>
-        <w:t xml:space="preserve">Deployment-oriented quantization.</w:t>
-      </w:r>
-      <w:r>
-        <w:t xml:space="preserve"> </w:t>
-      </w:r>
-      <w:r>
-        <w:t xml:space="preserve">Dynamic int8 quantization (</w:t>
-      </w:r>
-      <w:r>
-        <w:rPr>
-          <w:rStyle w:val="VerbatimChar"/>
-        </w:rPr>
-        <w:t xml:space="preserve">torch.quantization.quantize_dynamic</w:t>
-      </w:r>
-      <w:r>
-        <w:t xml:space="preserve">) is a common post-training optimisation for reducing model storage footprint without retraining. Its latency effect is hardware-dependent: x86 platforms typically benefit from the</w:t>
-      </w:r>
-      <w:r>
-        <w:t xml:space="preserve"> </w:t>
-      </w:r>
-      <w:r>
-        <w:rPr>
-          <w:rStyle w:val="VerbatimChar"/>
-        </w:rPr>
-        <w:t xml:space="preserve">fbgemm</w:t>
-      </w:r>
-      <w:r>
-        <w:t xml:space="preserve"> </w:t>
-      </w:r>
-      <w:r>
-        <w:t xml:space="preserve">backend’s optimised quantized kernels, while ARM/Apple Silicon platforms are restricted to</w:t>
-      </w:r>
-      <w:r>
-        <w:t xml:space="preserve"> </w:t>
-      </w:r>
-      <w:r>
-        <w:rPr>
-          <w:rStyle w:val="VerbatimChar"/>
-        </w:rPr>
-        <w:t xml:space="preserve">qnnpack</w:t>
-      </w:r>
-      <w:r>
-        <w:t xml:space="preserve">, whose dynamic-quantization kernels do not universally outperform native FP32 execution. Section 4.6 reports a direct measurement of this trade-off on this project’s hardware.</w:t>
-      </w:r>
-    </w:p>
-    <w:bookmarkEnd w:id="11"/>
-    <w:bookmarkStart w:id="21" w:name="problem-tasks-method"/>
-    <w:p>
-      <w:pPr>
-        <w:pStyle w:val="Heading2"/>
-      </w:pPr>
-      <w:r>
-        <w:t xml:space="preserve">3. Problem / Tasks / Method</w:t>
-      </w:r>
-    </w:p>
-    <w:bookmarkStart w:id="12" w:name="problem-statement"/>
-    <w:p>
-      <w:pPr>
-        <w:pStyle w:val="Heading3"/>
-      </w:pPr>
-      <w:r>
-        <w:t xml:space="preserve">3.1 Problem statement</w:t>
-      </w:r>
-    </w:p>
-    <w:p>
-      <w:pPr>
-        <w:pStyle w:val="FirstParagraph"/>
-      </w:pPr>
-      <w:r>
-        <w:rPr>
-          <w:b/>
-          <w:bCs/>
-        </w:rPr>
-        <w:t xml:space="preserve">RQ1.</w:t>
-      </w:r>
-      <w:r>
-        <w:t xml:space="preserve"> </w:t>
-      </w:r>
-      <w:r>
-        <w:t xml:space="preserve">Given a published low-resource ASR benchmark figure measured on a narrow, single-speaker corpus, how does the same model perform on a different, multi-speaker corpus of the same language, and by how much does the published figure overstate real-world generalisation?</w:t>
-      </w:r>
-    </w:p>
-    <w:p>
-      <w:pPr>
-        <w:pStyle w:val="BodyText"/>
-      </w:pPr>
-      <w:r>
-        <w:rPr>
-          <w:b/>
-          <w:bCs/>
-        </w:rPr>
-        <w:t xml:space="preserve">RQ2.</w:t>
-      </w:r>
-      <w:r>
-        <w:t xml:space="preserve"> </w:t>
-      </w:r>
-      <w:r>
-        <w:t xml:space="preserve">Given that generalisation gap, can fine-tuning the same checkpoint on speaker-diverse data close it, what is the cost to the model’s original narrow-domain performance, and how much of any measured improvement is genuine versus an artefact of failing to control for speaker overlap between training and evaluation data?</w:t>
-      </w:r>
-    </w:p>
-    <w:bookmarkEnd w:id="12"/>
-    <w:bookmarkStart w:id="16" w:name="system-architecture"/>
-    <w:p>
-      <w:pPr>
-        <w:pStyle w:val="Heading3"/>
-      </w:pPr>
-      <w:r>
-        <w:t xml:space="preserve">3.2 System Architecture</w:t>
-      </w:r>
-    </w:p>
-    <w:p>
-      <w:pPr>
-        <w:pStyle w:val="FirstParagraph"/>
-      </w:pPr>
-      <w:r>
-        <w:t xml:space="preserve">Figure 1 shows the full experimental pipeline connecting the two tasks. The audited checkpoint is the single starting point for both: Task 1 evaluates it as-is (zero-shot) on both corpora to establish the audit finding; Task 2 fine-tunes the same checkpoint’s transformer encoder and CTC head (with the convolutional feature encoder frozen) on speaker-diverse data. Both tasks’ outputs feed a shared generalisation re-evaluation, a matched-budget speaker-leakage ablation, error analysis, and an efficiency benchmark — the same measurement methodology applied consistently across every stage so results are directly comparable.</w:t>
-      </w:r>
-    </w:p>
-    <w:p>
-      <w:pPr>
-        <w:pStyle w:val="CaptionedFigure"/>
       </w:pPr>
       <w:r>
         <w:drawing>
           <wp:inline>
-            <wp:extent cx="5334000" cy="3655887"/>
+            <wp:extent cx="5334000" cy="1482613"/>
             <wp:effectExtent b="0" l="0" r="0" t="0"/>
-            <wp:docPr descr="Figure 1. System / experimental pipeline: from the audited checkpoint through both tasks to the shared downstream analyses." title="" id="14" name="Picture"/>
+            <wp:docPr descr="" title="" id="10" name="Picture"/>
             <a:graphic>
               <a:graphicData uri="http://schemas.openxmlformats.org/drawingml/2006/picture">
                 <pic:pic>
                   <pic:nvPicPr>
-                    <pic:cNvPr descr="appendix_screenshots/figure1_pipeline.png" id="15" name="Picture"/>
+                    <pic:cNvPr descr="appendix_screenshots/softwarica_coventry_logo.png" id="11" name="Picture"/>
                     <pic:cNvPicPr>
                       <a:picLocks noChangeArrowheads="1" noChangeAspect="1"/>
                     </pic:cNvPicPr>
                   </pic:nvPicPr>
                   <pic:blipFill>
-                    <a:blip r:embed="rId13"/>
+                    <a:blip r:embed="rId9"/>
+                    <a:stretch>
+                      <a:fillRect/>
+                    </a:stretch>
+                  </pic:blipFill>
+                  <pic:spPr bwMode="auto">
+                    <a:xfrm>
+                      <a:off x="0" y="0"/>
+                      <a:ext cx="5334000" cy="1482613"/>
+                    </a:xfrm>
+                    <a:prstGeom prst="rect">
+                      <a:avLst/>
+                    </a:prstGeom>
+                    <a:noFill/>
+                    <a:ln w="9525">
+                      <a:noFill/>
+                      <a:headEnd/>
+                      <a:tailEnd/>
+                    </a:ln>
+                  </pic:spPr>
+                </pic:pic>
+              </a:graphicData>
+            </a:graphic>
+          </wp:inline>
+        </w:drawing>
+      </w:r>
+    </w:p>
+    <w:p>
+      <w:pPr>
+        <w:pStyle w:val="BodyText"/>
+      </w:pPr>
+    </w:p>
+    <w:bookmarkStart w:id="37" w:name="X0c2e8d5000bd4e7f7602f311ec23643908b0291"/>
+    <w:p>
+      <w:pPr>
+        <w:pStyle w:val="Heading1"/>
+      </w:pPr>
+      <w:r>
+        <w:t xml:space="preserve">Auditing and Repairing a Published Nepali ASR Model</w:t>
+      </w:r>
+    </w:p>
+    <w:bookmarkStart w:id="12" w:name="a-speaker-diversity-case-study-on-xls-r"/>
+    <w:p>
+      <w:pPr>
+        <w:pStyle w:val="Heading3"/>
+      </w:pPr>
+      <w:r>
+        <w:t xml:space="preserve">A Speaker-Diversity Case Study on XLS-R</w:t>
+      </w:r>
+    </w:p>
+    <w:p>
+      <w:pPr>
+        <w:pStyle w:val="FirstParagraph"/>
+      </w:pPr>
+    </w:p>
+    <w:p>
+      <w:pPr>
+        <w:pStyle w:val="BodyText"/>
+      </w:pPr>
+      <w:r>
+        <w:rPr>
+          <w:b/>
+          <w:bCs/>
+        </w:rPr>
+        <w:t xml:space="preserve">Module:</w:t>
+      </w:r>
+      <w:r>
+        <w:t xml:space="preserve"> </w:t>
+      </w:r>
+      <w:r>
+        <w:t xml:space="preserve">ST7088CEM — Artificial Neural Networks</w:t>
+      </w:r>
+    </w:p>
+    <w:p>
+      <w:pPr>
+        <w:pStyle w:val="BodyText"/>
+      </w:pPr>
+      <w:r>
+        <w:rPr>
+          <w:b/>
+          <w:bCs/>
+        </w:rPr>
+        <w:t xml:space="preserve">Student:</w:t>
+      </w:r>
+      <w:r>
+        <w:t xml:space="preserve"> </w:t>
+      </w:r>
+      <w:r>
+        <w:t xml:space="preserve">Bimochan Raj Kunwar</w:t>
+      </w:r>
+    </w:p>
+    <w:p>
+      <w:pPr>
+        <w:pStyle w:val="BodyText"/>
+      </w:pPr>
+      <w:r>
+        <w:rPr>
+          <w:b/>
+          <w:bCs/>
+        </w:rPr>
+        <w:t xml:space="preserve">Coventry ID:</w:t>
+      </w:r>
+      <w:r>
+        <w:t xml:space="preserve"> </w:t>
+      </w:r>
+      <w:r>
+        <w:t xml:space="preserve">17108924</w:t>
+      </w:r>
+    </w:p>
+    <w:p>
+      <w:pPr>
+        <w:pStyle w:val="BodyText"/>
+      </w:pPr>
+      <w:r>
+        <w:rPr>
+          <w:b/>
+          <w:bCs/>
+        </w:rPr>
+        <w:t xml:space="preserve">Programme:</w:t>
+      </w:r>
+      <w:r>
+        <w:t xml:space="preserve"> </w:t>
+      </w:r>
+      <w:r>
+        <w:t xml:space="preserve">MSc7-S2</w:t>
+      </w:r>
+    </w:p>
+    <w:p>
+      <w:pPr>
+        <w:pStyle w:val="BodyText"/>
+      </w:pPr>
+      <w:r>
+        <w:rPr>
+          <w:b/>
+          <w:bCs/>
+        </w:rPr>
+        <w:t xml:space="preserve">Email:</w:t>
+      </w:r>
+      <w:r>
+        <w:t xml:space="preserve"> </w:t>
+      </w:r>
+      <w:r>
+        <w:t xml:space="preserve">250594@softwarica.edu.np</w:t>
+      </w:r>
+    </w:p>
+    <w:p>
+      <w:r>
+        <w:br w:type="page"/>
+      </w:r>
+    </w:p>
+    <w:bookmarkEnd w:id="12"/>
+    <w:bookmarkStart w:id="13" w:name="table-of-contents"/>
+    <w:p>
+      <w:pPr>
+        <w:pStyle w:val="Heading2"/>
+      </w:pPr>
+      <w:r>
+        <w:t xml:space="preserve">Table of Contents</w:t>
+      </w:r>
+    </w:p>
+    <w:tbl>
+      <w:tblPr>
+        <w:tblStyle w:val="Table"/>
+        <w:tblW w:type="pct" w:w="5000"/>
+        <w:tblLayout w:type="fixed"/>
+        <w:tblLook w:firstRow="1" w:lastRow="0" w:firstColumn="0" w:lastColumn="0" w:noHBand="0" w:noVBand="0" w:val="0020"/>
+      </w:tblPr>
+      <w:tblGrid>
+        <w:gridCol w:w="3960"/>
+        <w:gridCol w:w="3960"/>
+      </w:tblGrid>
+      <w:tr>
+        <w:trPr>
+          <w:tblHeader w:val="on"/>
+        </w:trPr>
+        <w:tc>
+          <w:tcPr/>
+          <w:p>
+            <w:pPr>
+              <w:pStyle w:val="Compact"/>
+              <w:jc w:val="left"/>
+            </w:pPr>
+            <w:r>
+              <w:t xml:space="preserve">Section</w:t>
+            </w:r>
+          </w:p>
+        </w:tc>
+        <w:tc>
+          <w:tcPr/>
+          <w:p>
+            <w:pPr>
+              <w:pStyle w:val="Compact"/>
+              <w:jc w:val="right"/>
+            </w:pPr>
+            <w:r>
+              <w:t xml:space="preserve">Page</w:t>
+            </w:r>
+          </w:p>
+        </w:tc>
+      </w:tr>
+      <w:tr>
+        <w:tc>
+          <w:tcPr/>
+          <w:p>
+            <w:pPr>
+              <w:pStyle w:val="Compact"/>
+              <w:jc w:val="left"/>
+            </w:pPr>
+            <w:r>
+              <w:t xml:space="preserve">Abstract</w:t>
+            </w:r>
+          </w:p>
+        </w:tc>
+        <w:tc>
+          <w:tcPr/>
+          <w:p>
+            <w:pPr>
+              <w:pStyle w:val="Compact"/>
+              <w:jc w:val="right"/>
+            </w:pPr>
+            <w:r>
+              <w:t xml:space="preserve">3</w:t>
+            </w:r>
+          </w:p>
+        </w:tc>
+      </w:tr>
+      <w:tr>
+        <w:tc>
+          <w:tcPr/>
+          <w:p>
+            <w:pPr>
+              <w:pStyle w:val="Compact"/>
+              <w:jc w:val="left"/>
+            </w:pPr>
+            <w:r>
+              <w:t xml:space="preserve">1. Introduction</w:t>
+            </w:r>
+          </w:p>
+        </w:tc>
+        <w:tc>
+          <w:tcPr/>
+          <w:p>
+            <w:pPr>
+              <w:pStyle w:val="Compact"/>
+              <w:jc w:val="right"/>
+            </w:pPr>
+            <w:r>
+              <w:t xml:space="preserve">3</w:t>
+            </w:r>
+          </w:p>
+        </w:tc>
+      </w:tr>
+      <w:tr>
+        <w:tc>
+          <w:tcPr/>
+          <w:p>
+            <w:pPr>
+              <w:pStyle w:val="Compact"/>
+              <w:jc w:val="left"/>
+            </w:pPr>
+            <w:r>
+              <w:t xml:space="preserve">2. Background / Related Work</w:t>
+            </w:r>
+          </w:p>
+        </w:tc>
+        <w:tc>
+          <w:tcPr/>
+          <w:p>
+            <w:pPr>
+              <w:pStyle w:val="Compact"/>
+              <w:jc w:val="right"/>
+            </w:pPr>
+            <w:r>
+              <w:t xml:space="preserve">4</w:t>
+            </w:r>
+          </w:p>
+        </w:tc>
+      </w:tr>
+      <w:tr>
+        <w:tc>
+          <w:tcPr/>
+          <w:p>
+            <w:pPr>
+              <w:pStyle w:val="Compact"/>
+              <w:jc w:val="left"/>
+            </w:pPr>
+            <w:r>
+              <w:t xml:space="preserve">3. Problem / Tasks / Method</w:t>
+            </w:r>
+          </w:p>
+        </w:tc>
+        <w:tc>
+          <w:tcPr/>
+          <w:p>
+            <w:pPr>
+              <w:pStyle w:val="Compact"/>
+              <w:jc w:val="right"/>
+            </w:pPr>
+            <w:r>
+              <w:t xml:space="preserve">5</w:t>
+            </w:r>
+          </w:p>
+        </w:tc>
+      </w:tr>
+      <w:tr>
+        <w:tc>
+          <w:tcPr/>
+          <w:p>
+            <w:pPr>
+              <w:pStyle w:val="Compact"/>
+              <w:jc w:val="left"/>
+            </w:pPr>
+            <w:r>
+              <w:t xml:space="preserve">   3.1 Problem statement</w:t>
+            </w:r>
+          </w:p>
+        </w:tc>
+        <w:tc>
+          <w:tcPr/>
+          <w:p>
+            <w:pPr>
+              <w:pStyle w:val="Compact"/>
+              <w:jc w:val="right"/>
+            </w:pPr>
+            <w:r>
+              <w:t xml:space="preserve">5</w:t>
+            </w:r>
+          </w:p>
+        </w:tc>
+      </w:tr>
+      <w:tr>
+        <w:tc>
+          <w:tcPr/>
+          <w:p>
+            <w:pPr>
+              <w:pStyle w:val="Compact"/>
+              <w:jc w:val="left"/>
+            </w:pPr>
+            <w:r>
+              <w:t xml:space="preserve">   3.2 System Architecture</w:t>
+            </w:r>
+          </w:p>
+        </w:tc>
+        <w:tc>
+          <w:tcPr/>
+          <w:p>
+            <w:pPr>
+              <w:pStyle w:val="Compact"/>
+              <w:jc w:val="right"/>
+            </w:pPr>
+            <w:r>
+              <w:t xml:space="preserve">5</w:t>
+            </w:r>
+          </w:p>
+        </w:tc>
+      </w:tr>
+      <w:tr>
+        <w:tc>
+          <w:tcPr/>
+          <w:p>
+            <w:pPr>
+              <w:pStyle w:val="Compact"/>
+              <w:jc w:val="left"/>
+            </w:pPr>
+            <w:r>
+              <w:t xml:space="preserve">   3.3 Dataset</w:t>
+            </w:r>
+          </w:p>
+        </w:tc>
+        <w:tc>
+          <w:tcPr/>
+          <w:p>
+            <w:pPr>
+              <w:pStyle w:val="Compact"/>
+              <w:jc w:val="right"/>
+            </w:pPr>
+            <w:r>
+              <w:t xml:space="preserve">6</w:t>
+            </w:r>
+          </w:p>
+        </w:tc>
+      </w:tr>
+      <w:tr>
+        <w:tc>
+          <w:tcPr/>
+          <w:p>
+            <w:pPr>
+              <w:pStyle w:val="Compact"/>
+              <w:jc w:val="left"/>
+            </w:pPr>
+            <w:r>
+              <w:t xml:space="preserve">   3.4 Preprocessing</w:t>
+            </w:r>
+          </w:p>
+        </w:tc>
+        <w:tc>
+          <w:tcPr/>
+          <w:p>
+            <w:pPr>
+              <w:pStyle w:val="Compact"/>
+              <w:jc w:val="right"/>
+            </w:pPr>
+            <w:r>
+              <w:t xml:space="preserve">6</w:t>
+            </w:r>
+          </w:p>
+        </w:tc>
+      </w:tr>
+      <w:tr>
+        <w:tc>
+          <w:tcPr/>
+          <w:p>
+            <w:pPr>
+              <w:pStyle w:val="Compact"/>
+              <w:jc w:val="left"/>
+            </w:pPr>
+            <w:r>
+              <w:t xml:space="preserve">   3.5 Task 1 Method — Benchmark Audit</w:t>
+            </w:r>
+          </w:p>
+        </w:tc>
+        <w:tc>
+          <w:tcPr/>
+          <w:p>
+            <w:pPr>
+              <w:pStyle w:val="Compact"/>
+              <w:jc w:val="right"/>
+            </w:pPr>
+            <w:r>
+              <w:t xml:space="preserve">6</w:t>
+            </w:r>
+          </w:p>
+        </w:tc>
+      </w:tr>
+      <w:tr>
+        <w:tc>
+          <w:tcPr/>
+          <w:p>
+            <w:pPr>
+              <w:pStyle w:val="Compact"/>
+              <w:jc w:val="left"/>
+            </w:pPr>
+            <w:r>
+              <w:t xml:space="preserve">   3.6 Task 2 Method — Fine-tuning Repair</w:t>
+            </w:r>
+          </w:p>
+        </w:tc>
+        <w:tc>
+          <w:tcPr/>
+          <w:p>
+            <w:pPr>
+              <w:pStyle w:val="Compact"/>
+              <w:jc w:val="right"/>
+            </w:pPr>
+            <w:r>
+              <w:t xml:space="preserve">6</w:t>
+            </w:r>
+          </w:p>
+        </w:tc>
+      </w:tr>
+      <w:tr>
+        <w:tc>
+          <w:tcPr/>
+          <w:p>
+            <w:pPr>
+              <w:pStyle w:val="Compact"/>
+              <w:jc w:val="left"/>
+            </w:pPr>
+            <w:r>
+              <w:t xml:space="preserve">4. Experimental Section</w:t>
+            </w:r>
+          </w:p>
+        </w:tc>
+        <w:tc>
+          <w:tcPr/>
+          <w:p>
+            <w:pPr>
+              <w:pStyle w:val="Compact"/>
+              <w:jc w:val="right"/>
+            </w:pPr>
+            <w:r>
+              <w:t xml:space="preserve">7</w:t>
+            </w:r>
+          </w:p>
+        </w:tc>
+      </w:tr>
+      <w:tr>
+        <w:tc>
+          <w:tcPr/>
+          <w:p>
+            <w:pPr>
+              <w:pStyle w:val="Compact"/>
+              <w:jc w:val="left"/>
+            </w:pPr>
+            <w:r>
+              <w:t xml:space="preserve">   4.1 Baseline audit</w:t>
+            </w:r>
+          </w:p>
+        </w:tc>
+        <w:tc>
+          <w:tcPr/>
+          <w:p>
+            <w:pPr>
+              <w:pStyle w:val="Compact"/>
+              <w:jc w:val="right"/>
+            </w:pPr>
+            <w:r>
+              <w:t xml:space="preserve">7</w:t>
+            </w:r>
+          </w:p>
+        </w:tc>
+      </w:tr>
+      <w:tr>
+        <w:tc>
+          <w:tcPr/>
+          <w:p>
+            <w:pPr>
+              <w:pStyle w:val="Compact"/>
+              <w:jc w:val="left"/>
+            </w:pPr>
+            <w:r>
+              <w:t xml:space="preserve">   4.2 Fine-tuned repair results</w:t>
+            </w:r>
+          </w:p>
+        </w:tc>
+        <w:tc>
+          <w:tcPr/>
+          <w:p>
+            <w:pPr>
+              <w:pStyle w:val="Compact"/>
+              <w:jc w:val="right"/>
+            </w:pPr>
+            <w:r>
+              <w:t xml:space="preserve">8</w:t>
+            </w:r>
+          </w:p>
+        </w:tc>
+      </w:tr>
+      <w:tr>
+        <w:tc>
+          <w:tcPr/>
+          <w:p>
+            <w:pPr>
+              <w:pStyle w:val="Compact"/>
+              <w:jc w:val="left"/>
+            </w:pPr>
+            <w:r>
+              <w:t xml:space="preserve">   4.3 Speaker-leakage ablation</w:t>
+            </w:r>
+          </w:p>
+        </w:tc>
+        <w:tc>
+          <w:tcPr/>
+          <w:p>
+            <w:pPr>
+              <w:pStyle w:val="Compact"/>
+              <w:jc w:val="right"/>
+            </w:pPr>
+            <w:r>
+              <w:t xml:space="preserve">8</w:t>
+            </w:r>
+          </w:p>
+        </w:tc>
+      </w:tr>
+      <w:tr>
+        <w:tc>
+          <w:tcPr/>
+          <w:p>
+            <w:pPr>
+              <w:pStyle w:val="Compact"/>
+              <w:jc w:val="left"/>
+            </w:pPr>
+            <w:r>
+              <w:t xml:space="preserve">   4.4 Error analysis</w:t>
+            </w:r>
+          </w:p>
+        </w:tc>
+        <w:tc>
+          <w:tcPr/>
+          <w:p>
+            <w:pPr>
+              <w:pStyle w:val="Compact"/>
+              <w:jc w:val="right"/>
+            </w:pPr>
+            <w:r>
+              <w:t xml:space="preserve">9</w:t>
+            </w:r>
+          </w:p>
+        </w:tc>
+      </w:tr>
+      <w:tr>
+        <w:tc>
+          <w:tcPr/>
+          <w:p>
+            <w:pPr>
+              <w:pStyle w:val="Compact"/>
+              <w:jc w:val="left"/>
+            </w:pPr>
+            <w:r>
+              <w:t xml:space="preserve">   4.5 Deployment / efficiency benchmark</w:t>
+            </w:r>
+          </w:p>
+        </w:tc>
+        <w:tc>
+          <w:tcPr/>
+          <w:p>
+            <w:pPr>
+              <w:pStyle w:val="Compact"/>
+              <w:jc w:val="right"/>
+            </w:pPr>
+            <w:r>
+              <w:t xml:space="preserve">9</w:t>
+            </w:r>
+          </w:p>
+        </w:tc>
+      </w:tr>
+      <w:tr>
+        <w:tc>
+          <w:tcPr/>
+          <w:p>
+            <w:pPr>
+              <w:pStyle w:val="Compact"/>
+              <w:jc w:val="left"/>
+            </w:pPr>
+            <w:r>
+              <w:t xml:space="preserve">5. Discussion of Findings</w:t>
+            </w:r>
+          </w:p>
+        </w:tc>
+        <w:tc>
+          <w:tcPr/>
+          <w:p>
+            <w:pPr>
+              <w:pStyle w:val="Compact"/>
+              <w:jc w:val="right"/>
+            </w:pPr>
+            <w:r>
+              <w:t xml:space="preserve">10</w:t>
+            </w:r>
+          </w:p>
+        </w:tc>
+      </w:tr>
+      <w:tr>
+        <w:tc>
+          <w:tcPr/>
+          <w:p>
+            <w:pPr>
+              <w:pStyle w:val="Compact"/>
+              <w:jc w:val="left"/>
+            </w:pPr>
+            <w:r>
+              <w:t xml:space="preserve">6. Conclusion</w:t>
+            </w:r>
+          </w:p>
+        </w:tc>
+        <w:tc>
+          <w:tcPr/>
+          <w:p>
+            <w:pPr>
+              <w:pStyle w:val="Compact"/>
+              <w:jc w:val="right"/>
+            </w:pPr>
+            <w:r>
+              <w:t xml:space="preserve">10</w:t>
+            </w:r>
+          </w:p>
+        </w:tc>
+      </w:tr>
+      <w:tr>
+        <w:tc>
+          <w:tcPr/>
+          <w:p>
+            <w:pPr>
+              <w:pStyle w:val="Compact"/>
+              <w:jc w:val="left"/>
+            </w:pPr>
+            <w:r>
+              <w:t xml:space="preserve">References</w:t>
+            </w:r>
+          </w:p>
+        </w:tc>
+        <w:tc>
+          <w:tcPr/>
+          <w:p>
+            <w:pPr>
+              <w:pStyle w:val="Compact"/>
+              <w:jc w:val="right"/>
+            </w:pPr>
+            <w:r>
+              <w:t xml:space="preserve">11</w:t>
+            </w:r>
+          </w:p>
+        </w:tc>
+      </w:tr>
+      <w:tr>
+        <w:tc>
+          <w:tcPr/>
+          <w:p>
+            <w:pPr>
+              <w:pStyle w:val="Compact"/>
+              <w:jc w:val="left"/>
+            </w:pPr>
+            <w:r>
+              <w:t xml:space="preserve">Appendices</w:t>
+            </w:r>
+          </w:p>
+        </w:tc>
+        <w:tc>
+          <w:tcPr/>
+          <w:p>
+            <w:pPr>
+              <w:pStyle w:val="Compact"/>
+              <w:jc w:val="right"/>
+            </w:pPr>
+            <w:r>
+              <w:t xml:space="preserve">11</w:t>
+            </w:r>
+          </w:p>
+        </w:tc>
+      </w:tr>
+      <w:tr>
+        <w:tc>
+          <w:tcPr/>
+          <w:p>
+            <w:pPr>
+              <w:pStyle w:val="Compact"/>
+              <w:jc w:val="left"/>
+            </w:pPr>
+            <w:r>
+              <w:t xml:space="preserve">   Appendix A — Project Proposal (Verbatim)</w:t>
+            </w:r>
+          </w:p>
+        </w:tc>
+        <w:tc>
+          <w:tcPr/>
+          <w:p>
+            <w:pPr>
+              <w:pStyle w:val="Compact"/>
+              <w:jc w:val="right"/>
+            </w:pPr>
+            <w:r>
+              <w:t xml:space="preserve">12</w:t>
+            </w:r>
+          </w:p>
+        </w:tc>
+      </w:tr>
+      <w:tr>
+        <w:tc>
+          <w:tcPr/>
+          <w:p>
+            <w:pPr>
+              <w:pStyle w:val="Compact"/>
+              <w:jc w:val="left"/>
+            </w:pPr>
+            <w:r>
+              <w:t xml:space="preserve">   Appendix B — Full Code Listing</w:t>
+            </w:r>
+          </w:p>
+        </w:tc>
+        <w:tc>
+          <w:tcPr/>
+          <w:p>
+            <w:pPr>
+              <w:pStyle w:val="Compact"/>
+              <w:jc w:val="right"/>
+            </w:pPr>
+            <w:r>
+              <w:t xml:space="preserve">13</w:t>
+            </w:r>
+          </w:p>
+        </w:tc>
+      </w:tr>
+      <w:tr>
+        <w:tc>
+          <w:tcPr/>
+          <w:p>
+            <w:pPr>
+              <w:pStyle w:val="Compact"/>
+              <w:jc w:val="left"/>
+            </w:pPr>
+            <w:r>
+              <w:t xml:space="preserve">   Appendix C — Evidence and Reproducibility Artifacts</w:t>
+            </w:r>
+          </w:p>
+        </w:tc>
+        <w:tc>
+          <w:tcPr/>
+          <w:p>
+            <w:pPr>
+              <w:pStyle w:val="Compact"/>
+              <w:jc w:val="right"/>
+            </w:pPr>
+            <w:r>
+              <w:t xml:space="preserve">54</w:t>
+            </w:r>
+          </w:p>
+        </w:tc>
+      </w:tr>
+      <w:tr>
+        <w:tc>
+          <w:tcPr/>
+          <w:p>
+            <w:pPr>
+              <w:pStyle w:val="Compact"/>
+              <w:jc w:val="left"/>
+            </w:pPr>
+            <w:r>
+              <w:t xml:space="preserve">   Appendix D — Extended Results Tables</w:t>
+            </w:r>
+          </w:p>
+        </w:tc>
+        <w:tc>
+          <w:tcPr/>
+          <w:p>
+            <w:pPr>
+              <w:pStyle w:val="Compact"/>
+              <w:jc w:val="right"/>
+            </w:pPr>
+            <w:r>
+              <w:t xml:space="preserve">58</w:t>
+            </w:r>
+          </w:p>
+        </w:tc>
+      </w:tr>
+    </w:tbl>
+    <w:p>
+      <w:r>
+        <w:br w:type="page"/>
+      </w:r>
+    </w:p>
+    <w:bookmarkEnd w:id="13"/>
+    <w:bookmarkStart w:id="14" w:name="abstract"/>
+    <w:p>
+      <w:pPr>
+        <w:pStyle w:val="Heading2"/>
+      </w:pPr>
+      <w:r>
+        <w:t xml:space="preserve">Abstract</w:t>
+      </w:r>
+    </w:p>
+    <w:p>
+      <w:pPr>
+        <w:pStyle w:val="FirstParagraph"/>
+      </w:pPr>
+      <w:r>
+        <w:t xml:space="preserve">Nepali automatic speech recognition (ASR) benchmarks are frequently measured on narrow, low-diversity corpora and then cited as evidence of general-purpose transcription quality. This project audits one such claim:</w:t>
+      </w:r>
+      <w:r>
+        <w:t xml:space="preserve"> </w:t>
+      </w:r>
+      <w:r>
+        <w:rPr>
+          <w:rStyle w:val="VerbatimChar"/>
+        </w:rPr>
+        <w:t xml:space="preserve">gagan3012/wav2vec2-xlsr-nepali</w:t>
+      </w:r>
+      <w:r>
+        <w:t xml:space="preserve">, a published Hugging Face XLS-R (wav2vec2) checkpoint that self-reports 5.97% word error rate (WER) on OpenSLR-43, its own single-speaker training corpus. Task 1 reproduces that figure in-domain (4.91% WER, confirming the claim) and measures the same checkpoint zero-shot on a different, multi-speaker corpus, OpenSLR-54 (62.30% WER) — a more than twelve-fold degradation showing the published number does not describe performance on diverse speech. Task 2 fine-tunes the same checkpoint on a 15-hour, 160-speaker, speaker-disjoint OpenSLR-54 subset to repair that gap: out-of-domain WER falls to 38.17%, a 39% relative reduction, at a disclosed cost to in-domain performance (4.91% → 16.40%). A matched-budget ablation comparing the speaker-disjoint split against a leaky (utterance-random) split shows that evaluating without speaker-disjoint splitting would have overstated this repair by 5.62 percentage points (32.55% vs. 38.17% WER) — a methodological finding as important as the headline result. Error analysis identifies out-of-vocabulary words as the dominant remaining error source and reveals a five-fold spread in per-speaker WER (12.5%–63.6%) that the aggregate metric conceals. Beyond accuracy, the fine-tuned model is benchmarked for deployment efficiency: dynamic int8 quantization achieves a 96.0% model size reduction but is measured to be 1.64×</w:t>
+      </w:r>
+      <w:r>
+        <w:t xml:space="preserve"> </w:t>
+      </w:r>
+      <w:r>
+        <w:rPr>
+          <w:i/>
+          <w:iCs/>
+        </w:rPr>
+        <w:t xml:space="preserve">slower</w:t>
+      </w:r>
+      <w:r>
+        <w:t xml:space="preserve"> </w:t>
+      </w:r>
+      <w:r>
+        <w:t xml:space="preserve">than FP32 on this Apple Silicon hardware, a mixed result reported honestly rather than framed as an unambiguous win. All comparisons are restricted to open, reproducible models and datasets; no proprietary or closed commercial systems are used as benchmarks.</w:t>
+      </w:r>
+    </w:p>
+    <w:bookmarkEnd w:id="14"/>
+    <w:bookmarkStart w:id="15" w:name="introduction"/>
+    <w:p>
+      <w:pPr>
+        <w:pStyle w:val="Heading2"/>
+      </w:pPr>
+      <w:r>
+        <w:t xml:space="preserve">1. Introduction</w:t>
+      </w:r>
+    </w:p>
+    <w:p>
+      <w:pPr>
+        <w:pStyle w:val="FirstParagraph"/>
+      </w:pPr>
+      <w:r>
+        <w:t xml:space="preserve">Nepali automatic speech recognition (ASR) benchmarks reported in the literature and on model-sharing platforms are frequently measured on narrow, low-diversity corpora — often a single speaker’s read speech — and then cited as evidence of general-purpose transcription quality. This is precisely the situation with</w:t>
+      </w:r>
+      <w:r>
+        <w:t xml:space="preserve"> </w:t>
+      </w:r>
+      <w:r>
+        <w:rPr>
+          <w:rStyle w:val="VerbatimChar"/>
+        </w:rPr>
+        <w:t xml:space="preserve">gagan3012/wav2vec2-xlsr-nepali</w:t>
+      </w:r>
+      <w:r>
+        <w:t xml:space="preserve">, a publicly available Hugging Face XLS-R (wav2vec2) checkpoint that self-reports a 5.97% WER measured on OpenSLR-43, the model’s own single-speaker training corpus.</w:t>
+      </w:r>
+    </w:p>
+    <w:p>
+      <w:pPr>
+        <w:pStyle w:val="BodyText"/>
+      </w:pPr>
+      <w:r>
+        <w:t xml:space="preserve">This project is organised around two research questions and two corresponding tasks.</w:t>
+      </w:r>
+      <w:r>
+        <w:t xml:space="preserve"> </w:t>
+      </w:r>
+      <w:r>
+        <w:rPr>
+          <w:b/>
+          <w:bCs/>
+        </w:rPr>
+        <w:t xml:space="preserve">RQ1 (Task 1 — Benchmark Audit):</w:t>
+      </w:r>
+      <w:r>
+        <w:t xml:space="preserve"> </w:t>
+      </w:r>
+      <w:r>
+        <w:t xml:space="preserve">does the published claim survive contact with genuinely diverse speech — a different, multi-speaker Nepali corpus the model was never trained on?</w:t>
+      </w:r>
+      <w:r>
+        <w:t xml:space="preserve"> </w:t>
+      </w:r>
+      <w:r>
+        <w:rPr>
+          <w:b/>
+          <w:bCs/>
+        </w:rPr>
+        <w:t xml:space="preserve">RQ2 (Task 2 — Fine-tuning Repair):</w:t>
+      </w:r>
+      <w:r>
+        <w:t xml:space="preserve"> </w:t>
+      </w:r>
+      <w:r>
+        <w:t xml:space="preserve">if the claim does not survive, can the same model be repaired by fine-tuning it on speaker-diverse data, and at what cost, and is any measured improvement genuine or an artefact of evaluation leakage?</w:t>
+      </w:r>
+    </w:p>
+    <w:p>
+      <w:pPr>
+        <w:pStyle w:val="BodyText"/>
+      </w:pPr>
+      <w:r>
+        <w:t xml:space="preserve">The remainder of this report proceeds as follows: Section 2 situates this work against XLS-R, low-resource ASR benchmarking practice, and quantization; Section 3 formalises the two tasks and the pipeline connecting them; Section 4 reports the experimental results for both tasks plus the ablation, error analysis, and efficiency benchmark; Section 5 discusses what these results mean and their limitations; Section 6 concludes.</w:t>
+      </w:r>
+    </w:p>
+    <w:bookmarkEnd w:id="15"/>
+    <w:bookmarkStart w:id="16" w:name="background-related-work"/>
+    <w:p>
+      <w:pPr>
+        <w:pStyle w:val="Heading2"/>
+      </w:pPr>
+      <w:r>
+        <w:t xml:space="preserve">2. Background / Related Work</w:t>
+      </w:r>
+    </w:p>
+    <w:p>
+      <w:pPr>
+        <w:pStyle w:val="FirstParagraph"/>
+      </w:pPr>
+      <w:r>
+        <w:rPr>
+          <w:b/>
+          <w:bCs/>
+        </w:rPr>
+        <w:t xml:space="preserve">XLS-R and cross-lingual speech representation.</w:t>
+      </w:r>
+      <w:r>
+        <w:t xml:space="preserve"> </w:t>
+      </w:r>
+      <w:r>
+        <w:t xml:space="preserve">XLS-R (Babu et al., 2021) extends wav2vec2’s self-supervised pretraining objective across 128 languages and 436k hours of unlabelled speech, producing representations that transfer well to low-resource languages via CTC fine-tuning on a comparatively small amount of labelled data. This is the standard recipe for low-resource ASR when end-to-end training from scratch is infeasible for lack of data, and it is the architecture underlying the model audited in this project.</w:t>
+      </w:r>
+    </w:p>
+    <w:p>
+      <w:pPr>
+        <w:pStyle w:val="BodyText"/>
+      </w:pPr>
+      <w:r>
+        <w:rPr>
+          <w:b/>
+          <w:bCs/>
+        </w:rPr>
+        <w:t xml:space="preserve">Low-resource ASR challenges.</w:t>
+      </w:r>
+      <w:r>
+        <w:t xml:space="preserve"> </w:t>
+      </w:r>
+      <w:r>
+        <w:t xml:space="preserve">Beyond raw data scarcity, low-resource ASR is complicated by dialectal variation, code-switching, and — the specific failure mode this project investigates — benchmark narrowness: a WER measured on very few speakers, sometimes one, conflates</w:t>
+      </w:r>
+      <w:r>
+        <w:t xml:space="preserve"> </w:t>
+      </w:r>
+      <w:r>
+        <w:t xml:space="preserve">“the model transcribes the language well”</w:t>
+      </w:r>
+      <w:r>
+        <w:t xml:space="preserve"> </w:t>
+      </w:r>
+      <w:r>
+        <w:t xml:space="preserve">with</w:t>
+      </w:r>
+      <w:r>
+        <w:t xml:space="preserve"> </w:t>
+      </w:r>
+      <w:r>
+        <w:t xml:space="preserve">“the model has partially memorised this speaker’s acoustic characteristics.”</w:t>
+      </w:r>
+      <w:r>
+        <w:t xml:space="preserve"> </w:t>
+      </w:r>
+      <w:r>
+        <w:t xml:space="preserve">The standard mitigation in the wider ASR literature is a speaker-disjoint train/test split — holding entire speakers out of training rather than splitting at the utterance level — precisely because utterance-level splits let a model exploit acoustic idiosyncrasies (accent, recording device, background noise profile) that a genuinely unseen speaker would not share. Section 4.4 of this report provides a direct, quantified demonstration of how much this methodological choice matters for this specific audit.</w:t>
+      </w:r>
+    </w:p>
+    <w:p>
+      <w:pPr>
+        <w:pStyle w:val="BodyText"/>
+      </w:pPr>
+      <w:r>
+        <w:rPr>
+          <w:b/>
+          <w:bCs/>
+        </w:rPr>
+        <w:t xml:space="preserve">Prior Nepali ASR work.</w:t>
+      </w:r>
+      <w:r>
+        <w:t xml:space="preserve"> </w:t>
+      </w:r>
+      <w:r>
+        <w:t xml:space="preserve">Public Nepali ASR resources remain limited relative to high-resource languages; OpenSLR hosts the two corpora used in this project (SLR43, SLR54) as among the largest open Nepali speech datasets available, and the audited checkpoint itself represents one of the few published Nepali-specific fine-tunes of a multilingual self-supervised model. Commercial cloud ASR systems can transcribe Nepali but are noted here only as context — they are explicitly</w:t>
+      </w:r>
+      <w:r>
+        <w:t xml:space="preserve"> </w:t>
+      </w:r>
+      <w:r>
+        <w:rPr>
+          <w:b/>
+          <w:bCs/>
+        </w:rPr>
+        <w:t xml:space="preserve">not</w:t>
+      </w:r>
+      <w:r>
+        <w:t xml:space="preserve"> </w:t>
+      </w:r>
+      <w:r>
+        <w:t xml:space="preserve">used as a comparison baseline anywhere in this report, consistent with the requirement to restrict evaluation to open, reproducible models.</w:t>
+      </w:r>
+    </w:p>
+    <w:p>
+      <w:pPr>
+        <w:pStyle w:val="BodyText"/>
+      </w:pPr>
+      <w:r>
+        <w:rPr>
+          <w:b/>
+          <w:bCs/>
+        </w:rPr>
+        <w:t xml:space="preserve">Speaker demographic inference from speech.</w:t>
+      </w:r>
+      <w:r>
+        <w:t xml:space="preserve"> </w:t>
+      </w:r>
+      <w:r>
+        <w:t xml:space="preserve">In the absence of annotated demographic metadata, mean fundamental frequency (F0) is a long-standing acoustic heuristic for inferring speaker gender, grounded in the physiological difference in typical adult male versus female vocal fold length. Section 3.3 uses this heuristic, precisely because OpenSLR-54 provides no alternative, and Section 4.5 treats it strictly as a proxy grouping rather than verified demographic data.</w:t>
+      </w:r>
+    </w:p>
+    <w:p>
+      <w:pPr>
+        <w:pStyle w:val="BodyText"/>
+      </w:pPr>
+      <w:r>
+        <w:rPr>
+          <w:b/>
+          <w:bCs/>
+        </w:rPr>
+        <w:t xml:space="preserve">Deployment-oriented quantization.</w:t>
+      </w:r>
+      <w:r>
+        <w:t xml:space="preserve"> </w:t>
+      </w:r>
+      <w:r>
+        <w:t xml:space="preserve">Dynamic int8 quantization (</w:t>
+      </w:r>
+      <w:r>
+        <w:rPr>
+          <w:rStyle w:val="VerbatimChar"/>
+        </w:rPr>
+        <w:t xml:space="preserve">torch.quantization.quantize_dynamic</w:t>
+      </w:r>
+      <w:r>
+        <w:t xml:space="preserve">) is a common post-training optimisation for reducing model storage footprint without retraining. Its latency effect is hardware-dependent: x86 platforms typically benefit from the</w:t>
+      </w:r>
+      <w:r>
+        <w:t xml:space="preserve"> </w:t>
+      </w:r>
+      <w:r>
+        <w:rPr>
+          <w:rStyle w:val="VerbatimChar"/>
+        </w:rPr>
+        <w:t xml:space="preserve">fbgemm</w:t>
+      </w:r>
+      <w:r>
+        <w:t xml:space="preserve"> </w:t>
+      </w:r>
+      <w:r>
+        <w:t xml:space="preserve">backend’s optimised quantized kernels, while ARM/Apple Silicon platforms are restricted to</w:t>
+      </w:r>
+      <w:r>
+        <w:t xml:space="preserve"> </w:t>
+      </w:r>
+      <w:r>
+        <w:rPr>
+          <w:rStyle w:val="VerbatimChar"/>
+        </w:rPr>
+        <w:t xml:space="preserve">qnnpack</w:t>
+      </w:r>
+      <w:r>
+        <w:t xml:space="preserve">, whose dynamic-quantization kernels do not universally outperform native FP32 execution. Section 4.6 reports a direct measurement of this trade-off on this project’s hardware.</w:t>
+      </w:r>
+    </w:p>
+    <w:bookmarkEnd w:id="16"/>
+    <w:bookmarkStart w:id="26" w:name="problem-tasks-method"/>
+    <w:p>
+      <w:pPr>
+        <w:pStyle w:val="Heading2"/>
+      </w:pPr>
+      <w:r>
+        <w:t xml:space="preserve">3. Problem / Tasks / Method</w:t>
+      </w:r>
+    </w:p>
+    <w:bookmarkStart w:id="17" w:name="problem-statement"/>
+    <w:p>
+      <w:pPr>
+        <w:pStyle w:val="Heading3"/>
+      </w:pPr>
+      <w:r>
+        <w:t xml:space="preserve">3.1 Problem statement</w:t>
+      </w:r>
+    </w:p>
+    <w:p>
+      <w:pPr>
+        <w:pStyle w:val="FirstParagraph"/>
+      </w:pPr>
+      <w:r>
+        <w:rPr>
+          <w:b/>
+          <w:bCs/>
+        </w:rPr>
+        <w:t xml:space="preserve">RQ1.</w:t>
+      </w:r>
+      <w:r>
+        <w:t xml:space="preserve"> </w:t>
+      </w:r>
+      <w:r>
+        <w:t xml:space="preserve">Given a published low-resource ASR benchmark figure measured on a narrow, single-speaker corpus, how does the same model perform on a different, multi-speaker corpus of the same language, and by how much does the published figure overstate real-world generalisation?</w:t>
+      </w:r>
+    </w:p>
+    <w:p>
+      <w:pPr>
+        <w:pStyle w:val="BodyText"/>
+      </w:pPr>
+      <w:r>
+        <w:rPr>
+          <w:b/>
+          <w:bCs/>
+        </w:rPr>
+        <w:t xml:space="preserve">RQ2.</w:t>
+      </w:r>
+      <w:r>
+        <w:t xml:space="preserve"> </w:t>
+      </w:r>
+      <w:r>
+        <w:t xml:space="preserve">Given that generalisation gap, can fine-tuning the same checkpoint on speaker-diverse data close it, what is the cost to the model’s original narrow-domain performance, and how much of any measured improvement is genuine versus an artefact of failing to control for speaker overlap between training and evaluation data?</w:t>
+      </w:r>
+    </w:p>
+    <w:bookmarkEnd w:id="17"/>
+    <w:bookmarkStart w:id="21" w:name="system-architecture"/>
+    <w:p>
+      <w:pPr>
+        <w:pStyle w:val="Heading3"/>
+      </w:pPr>
+      <w:r>
+        <w:t xml:space="preserve">3.2 System Architecture</w:t>
+      </w:r>
+    </w:p>
+    <w:p>
+      <w:pPr>
+        <w:pStyle w:val="FirstParagraph"/>
+      </w:pPr>
+      <w:r>
+        <w:t xml:space="preserve">Figure 1 shows the full experimental pipeline connecting the two tasks. The audited checkpoint is the single starting point for both: Task 1 evaluates it as-is (zero-shot) on both corpora to establish the audit finding; Task 2 fine-tunes the same checkpoint’s transformer encoder and CTC head (with the convolutional feature encoder frozen) on speaker-diverse data. Both tasks’ outputs feed a shared generalisation re-evaluation, a matched-budget speaker-leakage ablation, error analysis, and an efficiency benchmark — the same measurement methodology applied consistently across every stage so results are directly comparable.</w:t>
+      </w:r>
+    </w:p>
+    <w:p>
+      <w:pPr>
+        <w:pStyle w:val="CaptionedFigure"/>
+      </w:pPr>
+      <w:r>
+        <w:drawing>
+          <wp:inline>
+            <wp:extent cx="5334000" cy="3655887"/>
+            <wp:effectExtent b="0" l="0" r="0" t="0"/>
+            <wp:docPr descr="Figure 1. System / experimental pipeline: from the audited checkpoint through both tasks to the shared downstream analyses." title="" id="19" name="Picture"/>
+            <a:graphic>
+              <a:graphicData uri="http://schemas.openxmlformats.org/drawingml/2006/picture">
+                <pic:pic>
+                  <pic:nvPicPr>
+                    <pic:cNvPr descr="appendix_screenshots/figure1_pipeline.png" id="20" name="Picture"/>
+                    <pic:cNvPicPr>
+                      <a:picLocks noChangeArrowheads="1" noChangeAspect="1"/>
+                    </pic:cNvPicPr>
+                  </pic:nvPicPr>
+                  <pic:blipFill>
+                    <a:blip r:embed="rId18"/>
                     <a:stretch>
                       <a:fillRect/>
                     </a:stretch>
@@ -486,8 +1280,8 @@
         <w:t xml:space="preserve">Figure 1. System / experimental pipeline: from the audited checkpoint through both tasks to the shared downstream analyses.</w:t>
       </w:r>
     </w:p>
-    <w:bookmarkEnd w:id="16"/>
-    <w:bookmarkStart w:id="17" w:name="dataset"/>
+    <w:bookmarkEnd w:id="21"/>
+    <w:bookmarkStart w:id="22" w:name="dataset"/>
     <w:p>
       <w:pPr>
         <w:pStyle w:val="Heading3"/>
@@ -664,8 +1458,8 @@
         <w:t xml:space="preserve">.</w:t>
       </w:r>
     </w:p>
-    <w:bookmarkEnd w:id="17"/>
-    <w:bookmarkStart w:id="18" w:name="preprocessing"/>
+    <w:bookmarkEnd w:id="22"/>
+    <w:bookmarkStart w:id="23" w:name="preprocessing"/>
     <w:p>
       <w:pPr>
         <w:pStyle w:val="Heading3"/>
@@ -706,8 +1500,8 @@
         <w:t xml:space="preserve">).</w:t>
       </w:r>
     </w:p>
-    <w:bookmarkEnd w:id="18"/>
-    <w:bookmarkStart w:id="19" w:name="task-1-method-benchmark-audit"/>
+    <w:bookmarkEnd w:id="23"/>
+    <w:bookmarkStart w:id="24" w:name="task-1-method-benchmark-audit"/>
     <w:p>
       <w:pPr>
         <w:pStyle w:val="Heading3"/>
@@ -751,8 +1545,8 @@
         <w:t xml:space="preserve">measurement against which Task 2’s repair is judged.</w:t>
       </w:r>
     </w:p>
-    <w:bookmarkEnd w:id="19"/>
-    <w:bookmarkStart w:id="20" w:name="task-2-method-fine-tuning-repair"/>
+    <w:bookmarkEnd w:id="24"/>
+    <w:bookmarkStart w:id="25" w:name="task-2-method-fine-tuning-repair"/>
     <w:p>
       <w:pPr>
         <w:pStyle w:val="Heading3"/>
@@ -949,9 +1743,9 @@
         <w:t xml:space="preserve">(utterance-random) split of the same processed records for the Section 4.4 ablation.</w:t>
       </w:r>
     </w:p>
-    <w:bookmarkEnd w:id="20"/>
-    <w:bookmarkEnd w:id="21"/>
-    <w:bookmarkStart w:id="27" w:name="experimental-section"/>
+    <w:bookmarkEnd w:id="25"/>
+    <w:bookmarkEnd w:id="26"/>
+    <w:bookmarkStart w:id="32" w:name="experimental-section"/>
     <w:p>
       <w:pPr>
         <w:pStyle w:val="Heading2"/>
@@ -980,7 +1774,7 @@
         <w:t xml:space="preserve">. Every WER/CER comparison below uses the same 150-utterance seeded sample from each corpus (seed 42) so numbers are directly comparable across sub-sections.</w:t>
       </w:r>
     </w:p>
-    <w:bookmarkStart w:id="22" w:name="X99fbbffd03045a9cb72d59a618c94e36607e72b"/>
+    <w:bookmarkStart w:id="27" w:name="X99fbbffd03045a9cb72d59a618c94e36607e72b"/>
     <w:p>
       <w:pPr>
         <w:pStyle w:val="Heading3"/>
@@ -1161,8 +1955,8 @@
         <w:t xml:space="preserve">The in-domain measurement is close to (marginally better than) the published figure, confirming no discrepancy on the model’s own distribution. The out-of-domain measurement is more than twelve times worse. Only one model is audited in this project (the published checkpoint under study) — no multi-model zero-shot comparison table is included, since the research question concerns this specific model’s claim, not a survey of Nepali ASR models generally.</w:t>
       </w:r>
     </w:p>
-    <w:bookmarkEnd w:id="22"/>
-    <w:bookmarkStart w:id="23" w:name="fine-tuned-repair-results-task-2"/>
+    <w:bookmarkEnd w:id="27"/>
+    <w:bookmarkStart w:id="28" w:name="fine-tuned-repair-results-task-2"/>
     <w:p>
       <w:pPr>
         <w:pStyle w:val="Heading3"/>
@@ -1328,8 +2122,8 @@
         <w:t xml:space="preserve">split); the 38.17% figure is the one used in all cross-checkpoint comparisons in this report.</w:t>
       </w:r>
     </w:p>
-    <w:bookmarkEnd w:id="23"/>
-    <w:bookmarkStart w:id="24" w:name="speaker-leakage-ablation"/>
+    <w:bookmarkEnd w:id="28"/>
+    <w:bookmarkStart w:id="29" w:name="speaker-leakage-ablation"/>
     <w:p>
       <w:pPr>
         <w:pStyle w:val="Heading3"/>
@@ -1518,8 +2312,8 @@
         <w:t xml:space="preserve">that reflects memorisation of already-seen speakers, not genuine generalisation.</w:t>
       </w:r>
     </w:p>
-    <w:bookmarkEnd w:id="24"/>
-    <w:bookmarkStart w:id="25" w:name="error-analysis"/>
+    <w:bookmarkEnd w:id="29"/>
+    <w:bookmarkStart w:id="30" w:name="error-analysis"/>
     <w:p>
       <w:pPr>
         <w:pStyle w:val="Heading3"/>
@@ -1770,8 +2564,8 @@
         <w:t xml:space="preserve">: across the 16 speakers represented in the sample, per-speaker mean WER ranges from 12.5% (best, n=12) to 63.6% (worst, n=11) — a five-fold difference the aggregate 38.17% figure obscures entirely. Full per-utterance results are in Appendix D.</w:t>
       </w:r>
     </w:p>
-    <w:bookmarkEnd w:id="25"/>
-    <w:bookmarkStart w:id="26" w:name="deployment-efficiency-benchmark"/>
+    <w:bookmarkEnd w:id="30"/>
+    <w:bookmarkStart w:id="31" w:name="deployment-efficiency-benchmark"/>
     <w:p>
       <w:pPr>
         <w:pStyle w:val="Heading3"/>
@@ -2050,9 +2844,9 @@
         <w:t xml:space="preserve">one.</w:t>
       </w:r>
     </w:p>
-    <w:bookmarkEnd w:id="26"/>
-    <w:bookmarkEnd w:id="27"/>
-    <w:bookmarkStart w:id="28" w:name="discussion-of-findings"/>
+    <w:bookmarkEnd w:id="31"/>
+    <w:bookmarkEnd w:id="32"/>
+    <w:bookmarkStart w:id="33" w:name="discussion-of-findings"/>
     <w:p>
       <w:pPr>
         <w:pStyle w:val="Heading2"/>
@@ -2181,8 +2975,8 @@
         <w:t xml:space="preserve">This work relates back to the motivating concern in Section 1: published low-resource ASR numbers, including outside this specific project, should be read with the training corpus’s speaker diversity in mind, not taken at face value.</w:t>
       </w:r>
     </w:p>
-    <w:bookmarkEnd w:id="28"/>
-    <w:bookmarkStart w:id="29" w:name="conclusion"/>
+    <w:bookmarkEnd w:id="33"/>
+    <w:bookmarkStart w:id="34" w:name="conclusion"/>
     <w:p>
       <w:pPr>
         <w:pStyle w:val="Heading2"/>
@@ -2199,8 +2993,8 @@
         <w:t xml:space="preserve">This project set out to answer whether a specific published Nepali ASR benchmark claim (5.97% WER) survives contact with speaker-diverse speech (RQ1), and whether the same model can be repaired if not (RQ2). It does not survive: the same checkpoint’s WER rises to 62.30% on a different, multi-speaker corpus. Fine-tuning that checkpoint on a 15-hour, speaker-disjoint, 160-speaker subset repairs a substantial share of that gap (to 38.17% WER), at a disclosed cost to the model’s original narrow-domain sharpness, and a matched-budget ablation confirms this improvement is genuine rather than a leakage artefact. The contribution of this project is an open, reproducible Nepali ASR audit-and-repair case study with an accompanying efficiency benchmark — not a claim of new state-of-the-art performance. Future work would extend the fine-tuning corpus beyond 15 hours, replace the F0-pitch pseudo-label with verified demographic metadata should a real bias analysis be required, and test on conversational or code-switched Nepali speech rather than read speech alone.</w:t>
       </w:r>
     </w:p>
-    <w:bookmarkEnd w:id="29"/>
-    <w:bookmarkStart w:id="30" w:name="references"/>
+    <w:bookmarkEnd w:id="34"/>
+    <w:bookmarkStart w:id="35" w:name="references"/>
     <w:p>
       <w:pPr>
         <w:pStyle w:val="Heading2"/>
@@ -2335,8 +3129,8 @@
         <w:t xml:space="preserve">MLflow documentation (experiment tracking).</w:t>
       </w:r>
     </w:p>
-    <w:bookmarkEnd w:id="30"/>
-    <w:bookmarkStart w:id="31" w:name="appendices-not-counted-in-word-limit"/>
+    <w:bookmarkEnd w:id="35"/>
+    <w:bookmarkStart w:id="36" w:name="appendices-not-counted-in-word-limit"/>
     <w:p>
       <w:pPr>
         <w:pStyle w:val="Heading2"/>
@@ -2457,8 +3251,8 @@
         <w:t xml:space="preserve">Extended results tables (full per-utterance WER/CER, complete error-category listing)</w:t>
       </w:r>
     </w:p>
-    <w:bookmarkEnd w:id="31"/>
-    <w:bookmarkEnd w:id="32"/>
+    <w:bookmarkEnd w:id="36"/>
+    <w:bookmarkEnd w:id="37"/>
     <w:sectPr>
       <w:footnotePr>
         <w:numRestart w:val="eachSect"/>

</xml_diff>

<commit_message>
Restore full Appendix B code listing and Appendix C screenshots per department template
Per the ST7088CEM report template's explicit wording ("Full code, all
scripts, in totality" / "screenshots of every experiment run"),
restore Appendix B to all 16 source files and Appendix C to all 7
screenshots (previously trimmed per an earlier, narrower reading of
supervisor feedback). Recompute and verify all Table of Contents page
numbers against the resulting 84-page document.

Co-Authored-By: Claude Sonnet 5 <noreply@anthropic.com>
</commit_message>
<xml_diff>
--- a/report.docx
+++ b/report.docx
@@ -777,7 +777,7 @@
               <w:jc w:val="left"/>
             </w:pPr>
             <w:r>
-              <w:t xml:space="preserve">   Appendix B — Full Code Listing (representative subset)</w:t>
+              <w:t xml:space="preserve">   Appendix B — Full Code Listing</w:t>
             </w:r>
           </w:p>
         </w:tc>
@@ -815,7 +815,7 @@
               <w:jc w:val="right"/>
             </w:pPr>
             <w:r>
-              <w:t xml:space="preserve">33</w:t>
+              <w:t xml:space="preserve">57</w:t>
             </w:r>
           </w:p>
         </w:tc>
@@ -841,7 +841,7 @@
               <w:jc w:val="right"/>
             </w:pPr>
             <w:r>
-              <w:t xml:space="preserve">35</w:t>
+              <w:t xml:space="preserve">60</w:t>
             </w:r>
           </w:p>
         </w:tc>

</xml_diff>

<commit_message>
Complete supervisor checklist: appendix links, node-link diagram, distinct conclusion
- Appendix E (new): GitHub repo link, YouTube video link, dataset
  links (OpenSLR-43/54), audited checkpoint link.
- Appendix B.0 (new): highlights the core architecture specifically --
  Figure 1 reproduced, a new standard node-link "deep neural network"
  diagram (input layer -> hidden layers -> output layer, styled after
  the classic textbook illustration) as a complementary view, and the
  exact model-loading/freezing code.
- Abstract reproduced at the Appendices divider page for appendix-only
  reference.
- Conclusion rewritten to be genuinely distinct from Discussion of
  Findings (contribution + future work, not a restatement of the RQ1/
  RQ2 analysis) and given its own page break.
- TOC page numbers recomputed and verified against the rebuilt
  89-page document.

Co-Authored-By: Claude Sonnet 5 <noreply@anthropic.com>
</commit_message>
<xml_diff>
--- a/report.docx
+++ b/report.docx
@@ -685,7 +685,7 @@
               <w:jc w:val="right"/>
             </w:pPr>
             <w:r>
-              <w:t xml:space="preserve">12</w:t>
+              <w:t xml:space="preserve">13</w:t>
             </w:r>
           </w:p>
         </w:tc>
@@ -711,7 +711,7 @@
               <w:jc w:val="right"/>
             </w:pPr>
             <w:r>
-              <w:t xml:space="preserve">12</w:t>
+              <w:t xml:space="preserve">13</w:t>
             </w:r>
           </w:p>
         </w:tc>
@@ -763,7 +763,7 @@
               <w:jc w:val="right"/>
             </w:pPr>
             <w:r>
-              <w:t xml:space="preserve">14</w:t>
+              <w:t xml:space="preserve">15</w:t>
             </w:r>
           </w:p>
         </w:tc>
@@ -777,7 +777,7 @@
               <w:jc w:val="left"/>
             </w:pPr>
             <w:r>
-              <w:t xml:space="preserve">   Appendix B — Full Code Listing</w:t>
+              <w:t xml:space="preserve">   Appendix B — Full Code Listing (incl. B.0 Core Architecture)</w:t>
             </w:r>
           </w:p>
         </w:tc>
@@ -789,7 +789,7 @@
               <w:jc w:val="right"/>
             </w:pPr>
             <w:r>
-              <w:t xml:space="preserve">16</w:t>
+              <w:t xml:space="preserve">17</w:t>
             </w:r>
           </w:p>
         </w:tc>
@@ -815,7 +815,7 @@
               <w:jc w:val="right"/>
             </w:pPr>
             <w:r>
-              <w:t xml:space="preserve">57</w:t>
+              <w:t xml:space="preserve">61</w:t>
             </w:r>
           </w:p>
         </w:tc>
@@ -841,7 +841,33 @@
               <w:jc w:val="right"/>
             </w:pPr>
             <w:r>
-              <w:t xml:space="preserve">60</w:t>
+              <w:t xml:space="preserve">64</w:t>
+            </w:r>
+          </w:p>
+        </w:tc>
+      </w:tr>
+      <w:tr>
+        <w:tc>
+          <w:tcPr/>
+          <w:p>
+            <w:pPr>
+              <w:pStyle w:val="Compact"/>
+              <w:jc w:val="left"/>
+            </w:pPr>
+            <w:r>
+              <w:t xml:space="preserve">   Appendix E — Project Links and Data Sources</w:t>
+            </w:r>
+          </w:p>
+        </w:tc>
+        <w:tc>
+          <w:tcPr/>
+          <w:p>
+            <w:pPr>
+              <w:pStyle w:val="Compact"/>
+              <w:jc w:val="right"/>
+            </w:pPr>
+            <w:r>
+              <w:t xml:space="preserve">89</w:t>
             </w:r>
           </w:p>
         </w:tc>
@@ -1393,6 +1419,14 @@
         <w:pStyle w:val="BodyText"/>
       </w:pPr>
       <w:r>
+        <w:t xml:space="preserve">Appendix B.0 additionally shows this same architecture redrawn as a standard node-link diagram (input layer → multiple hidden layers → output layer), alongside the exact code that implements the frozen/fine-tuned split shown above.</w:t>
+      </w:r>
+    </w:p>
+    <w:p>
+      <w:pPr>
+        <w:pStyle w:val="BodyText"/>
+      </w:pPr>
+      <w:r>
         <w:t xml:space="preserve">Figure 2 shows the surrounding experimental pipeline that connects the two tasks to the shared downstream analyses. The audited checkpoint is the single starting point for both: Task 1 evaluates it as-is (zero-shot) on both corpora to establish the audit finding; Task 2 fine-tunes the same checkpoint as described above. Both tasks’ outputs feed a shared generalisation re-evaluation, a matched-budget speaker-leakage ablation, error analysis, and an efficiency benchmark — the same measurement methodology applied consistently across every stage so results are directly comparable.</w:t>
       </w:r>
     </w:p>
@@ -3146,6 +3180,11 @@
         <w:t xml:space="preserve">This work relates back to the motivating concern in Section 1: published low-resource ASR numbers, including outside this specific project, should be read with the training corpus’s speaker diversity in mind, not taken at face value.</w:t>
       </w:r>
     </w:p>
+    <w:p>
+      <w:r>
+        <w:br w:type="page"/>
+      </w:r>
+    </w:p>
     <w:bookmarkEnd w:id="39"/>
     <w:bookmarkStart w:id="40" w:name="conclusion"/>
     <w:p>
@@ -3161,7 +3200,43 @@
         <w:pStyle w:val="FirstParagraph"/>
       </w:pPr>
       <w:r>
-        <w:t xml:space="preserve">This project set out to answer whether a specific published Nepali ASR benchmark claim (5.97% WER) survives contact with speaker-diverse speech (RQ1), and whether the same model can be repaired if not (RQ2). It does not survive: the same checkpoint’s WER rises to 62.30% on a different, multi-speaker corpus. Fine-tuning that checkpoint on a 15-hour, speaker-disjoint, 160-speaker subset repairs a substantial share of that gap (to 38.17% WER), at a disclosed cost to the model’s original narrow-domain sharpness, and a matched-budget ablation confirms this improvement is genuine rather than a leakage artefact. The contribution of this project is an open, reproducible Nepali ASR audit-and-repair case study with an accompanying efficiency benchmark — not a claim of new state-of-the-art performance. Future work would extend the fine-tuning corpus beyond 15 hours, replace the F0-pitch pseudo-label with verified demographic metadata should a real bias analysis be required, and test on conversational or code-switched Nepali speech rather than read speech alone.</w:t>
+        <w:t xml:space="preserve">This project delivered two things: an audit that shows a published Nepali ASR benchmark figure does not hold on diverse speech, and a repair that closes a substantial share of that gap while being honest about its cost and limits. Headline numbers: 5.97% (published) → 4.91%/62.30% (measured, in-/out-of-domain) → 38.17% (out-of-domain, after fine-tuning), with the speaker-leakage ablation confirming that final number is genuine rather than inflated by evaluation leakage.</w:t>
+      </w:r>
+    </w:p>
+    <w:p>
+      <w:pPr>
+        <w:pStyle w:val="BodyText"/>
+      </w:pPr>
+      <w:r>
+        <w:rPr>
+          <w:b/>
+          <w:bCs/>
+        </w:rPr>
+        <w:t xml:space="preserve">Contribution.</w:t>
+      </w:r>
+      <w:r>
+        <w:t xml:space="preserve"> </w:t>
+      </w:r>
+      <w:r>
+        <w:t xml:space="preserve">The project is framed deliberately as an open, reproducible audit-and-repair case study, not a claim of new state-of-the-art Nepali ASR performance. Its two artefacts of independent value beyond the headline numbers are: (i) the speaker-leakage ablation itself, as a reusable methodological check any low-resource ASR project can apply before trusting its own reported improvement; and (ii) the efficiency benchmark’s honestly-reported negative latency result, as a reminder that deployment optimisations need re-measurement on target hardware rather than being assumed from general expectation.</w:t>
+      </w:r>
+    </w:p>
+    <w:p>
+      <w:pPr>
+        <w:pStyle w:val="BodyText"/>
+      </w:pPr>
+      <w:r>
+        <w:rPr>
+          <w:b/>
+          <w:bCs/>
+        </w:rPr>
+        <w:t xml:space="preserve">Future work.</w:t>
+      </w:r>
+      <w:r>
+        <w:t xml:space="preserve"> </w:t>
+      </w:r>
+      <w:r>
+        <w:t xml:space="preserve">Three concrete extensions follow directly from the limitations in Section 5: extend the fine-tuning corpus beyond 15 hours and 160 speakers to close more of the remaining out-of-domain gap; replace the F0-pitch gender pseudo-label with verified demographic metadata if a real fairness/bias analysis is required; and evaluate on conversational or code-switched Nepali speech, since all data used here is read speech only.</w:t>
       </w:r>
     </w:p>
     <w:bookmarkEnd w:id="40"/>
@@ -3312,6 +3387,36 @@
     </w:p>
     <w:p>
       <w:pPr>
+        <w:pStyle w:val="FirstParagraph"/>
+      </w:pPr>
+      <w:r>
+        <w:rPr>
+          <w:b/>
+          <w:bCs/>
+        </w:rPr>
+        <w:t xml:space="preserve">Abstract (reproduced for appendix-only reference):</w:t>
+      </w:r>
+      <w:r>
+        <w:t xml:space="preserve"> </w:t>
+      </w:r>
+      <w:r>
+        <w:t xml:space="preserve">Nepali automatic speech recognition (ASR) benchmarks are frequently measured on narrow, low-diversity corpora and then cited as evidence of general-purpose transcription quality. This project audits one such claim:</w:t>
+      </w:r>
+      <w:r>
+        <w:t xml:space="preserve"> </w:t>
+      </w:r>
+      <w:r>
+        <w:rPr>
+          <w:rStyle w:val="VerbatimChar"/>
+        </w:rPr>
+        <w:t xml:space="preserve">gagan3012/wav2vec2-xlsr-nepali</w:t>
+      </w:r>
+      <w:r>
+        <w:t xml:space="preserve">, a published Hugging Face XLS-R (wav2vec2) checkpoint that self-reports 5.97% word error rate (WER) on OpenSLR-43, its own single-speaker training corpus. Task 1 reproduces that figure in-domain (4.91% WER, confirming the claim) and measures the same checkpoint zero-shot on a different, multi-speaker corpus, OpenSLR-54 (62.30% WER) — a more than twelve-fold degradation. Task 2 fine-tunes the same checkpoint on a 15-hour, 160-speaker, speaker-disjoint OpenSLR-54 subset to repair that gap: out-of-domain WER falls to 38.17%, a 39% relative reduction. A matched-budget speaker-leakage ablation confirms this improvement is genuine, not an artefact of evaluation leakage. The fine-tuned model is also benchmarked for deployment efficiency, with a mixed, honestly-reported result. See the full Abstract on page 3 for complete details.</w:t>
+      </w:r>
+    </w:p>
+    <w:p>
+      <w:pPr>
         <w:pStyle w:val="Compact"/>
         <w:numPr>
           <w:ilvl w:val="0"/>
@@ -3375,7 +3480,7 @@
         <w:t xml:space="preserve">scripts/*.py</w:t>
       </w:r>
       <w:r>
-        <w:t xml:space="preserve">), external-source adaptations cited in module docstrings</w:t>
+        <w:t xml:space="preserve">), external-source adaptations cited in module docstrings; B.0 highlights the core architecture code and diagram specifically</w:t>
       </w:r>
     </w:p>
     <w:p>
@@ -3420,6 +3525,28 @@
       </w:r>
       <w:r>
         <w:t xml:space="preserve">Extended results tables (full per-utterance WER/CER, complete error-category listing)</w:t>
+      </w:r>
+    </w:p>
+    <w:p>
+      <w:pPr>
+        <w:pStyle w:val="Compact"/>
+        <w:numPr>
+          <w:ilvl w:val="0"/>
+          <w:numId w:val="1002"/>
+        </w:numPr>
+      </w:pPr>
+      <w:r>
+        <w:rPr>
+          <w:b/>
+          <w:bCs/>
+        </w:rPr>
+        <w:t xml:space="preserve">Appendix E:</w:t>
+      </w:r>
+      <w:r>
+        <w:t xml:space="preserve"> </w:t>
+      </w:r>
+      <w:r>
+        <w:t xml:space="preserve">Project links (GitHub repository, YouTube presentation) and data source links</w:t>
       </w:r>
     </w:p>
     <w:bookmarkEnd w:id="42"/>

</xml_diff>